<commit_message>
generate excel with comments and datetype from db query works
</commit_message>
<xml_diff>
--- a/Feedback from user testing.docx
+++ b/Feedback from user testing.docx
@@ -66,19 +66,103 @@
         <w:rPr>
           <w:lang w:val="da-DK"/>
         </w:rPr>
-        <w:t xml:space="preserve">Bulk id standard for cold fingers? </w:t>
-      </w:r>
-      <w:r>
-        <w:rPr>
-          <w:lang w:val="da-DK"/>
-        </w:rPr>
-        <w:t>Bruger ”bulk sample” som et sample der ikke varierer alt efter hvor dybt subsampler den. Og core id som varierer alt efter dybde. Kommentarer om field sample id.</w:t>
-      </w:r>
-      <w:r>
-        <w:rPr>
-          <w:lang w:val="da-DK"/>
-        </w:rPr>
-        <w:t xml:space="preserve"> Mener ikke bulk sampleID i archive sample skal være required (spørg jesper). </w:t>
+        <w:t xml:space="preserve">Bulk id standard for </w:t>
+      </w:r>
+      <w:proofErr w:type="spellStart"/>
+      <w:r>
+        <w:rPr>
+          <w:lang w:val="da-DK"/>
+        </w:rPr>
+        <w:t>cold</w:t>
+      </w:r>
+      <w:proofErr w:type="spellEnd"/>
+      <w:r>
+        <w:rPr>
+          <w:lang w:val="da-DK"/>
+        </w:rPr>
+        <w:t xml:space="preserve"> fingers? </w:t>
+      </w:r>
+      <w:r>
+        <w:rPr>
+          <w:lang w:val="da-DK"/>
+        </w:rPr>
+        <w:t xml:space="preserve">Bruger ”bulk sample” som et sample der ikke varierer alt efter hvor dybt subsampler den. Og core id som varierer alt efter dybde. Kommentarer om </w:t>
+      </w:r>
+      <w:proofErr w:type="spellStart"/>
+      <w:r>
+        <w:rPr>
+          <w:lang w:val="da-DK"/>
+        </w:rPr>
+        <w:t>field</w:t>
+      </w:r>
+      <w:proofErr w:type="spellEnd"/>
+      <w:r>
+        <w:rPr>
+          <w:lang w:val="da-DK"/>
+        </w:rPr>
+        <w:t xml:space="preserve"> sample id.</w:t>
+      </w:r>
+      <w:r>
+        <w:rPr>
+          <w:lang w:val="da-DK"/>
+        </w:rPr>
+        <w:t xml:space="preserve"> Mener ikke bulk </w:t>
+      </w:r>
+      <w:proofErr w:type="spellStart"/>
+      <w:r>
+        <w:rPr>
+          <w:lang w:val="da-DK"/>
+        </w:rPr>
+        <w:t>sampleID</w:t>
+      </w:r>
+      <w:proofErr w:type="spellEnd"/>
+      <w:r>
+        <w:rPr>
+          <w:lang w:val="da-DK"/>
+        </w:rPr>
+        <w:t xml:space="preserve"> i </w:t>
+      </w:r>
+      <w:proofErr w:type="spellStart"/>
+      <w:r>
+        <w:rPr>
+          <w:lang w:val="da-DK"/>
+        </w:rPr>
+        <w:t>archive</w:t>
+      </w:r>
+      <w:proofErr w:type="spellEnd"/>
+      <w:r>
+        <w:rPr>
+          <w:lang w:val="da-DK"/>
+        </w:rPr>
+        <w:t xml:space="preserve"> sample skal være </w:t>
+      </w:r>
+      <w:proofErr w:type="spellStart"/>
+      <w:r>
+        <w:rPr>
+          <w:lang w:val="da-DK"/>
+        </w:rPr>
+        <w:t>required</w:t>
+      </w:r>
+      <w:proofErr w:type="spellEnd"/>
+      <w:r>
+        <w:rPr>
+          <w:lang w:val="da-DK"/>
+        </w:rPr>
+        <w:t xml:space="preserve"> (spørg </w:t>
+      </w:r>
+      <w:proofErr w:type="spellStart"/>
+      <w:r>
+        <w:rPr>
+          <w:lang w:val="da-DK"/>
+        </w:rPr>
+        <w:t>jesper</w:t>
+      </w:r>
+      <w:proofErr w:type="spellEnd"/>
+      <w:r>
+        <w:rPr>
+          <w:lang w:val="da-DK"/>
+        </w:rPr>
+        <w:t xml:space="preserve">). </w:t>
       </w:r>
     </w:p>
     <w:p>
@@ -104,6 +188,21 @@
     <w:p>
       <w:r>
         <w:t>Nice to have: upload of html files for her reports.</w:t>
+      </w:r>
+    </w:p>
+    <w:p/>
+    <w:p>
+      <w:r>
+        <w:t>Antonio:</w:t>
+      </w:r>
+      <w:r>
+        <w:br/>
+      </w:r>
+      <w:r>
+        <w:t xml:space="preserve">“It doesn’t matter what Mikkel needs, it matters what the community requires which is described here”: </w:t>
+      </w:r>
+      <w:r>
+        <w:t>https://github.com/MIxS-MInAS/MIxS-MInAS.github.io/raw/master/docs/assets/checklists/versions/AncientSedimentMIMS_v0.1.0.xls</w:t>
       </w:r>
     </w:p>
     <w:sectPr>

</xml_diff>